<commit_message>
:memo: docs: Atualiza a sessão de artigos relacionados do artigo
</commit_message>
<xml_diff>
--- a/docs/Arquivo de Investigação - classificação.docx
+++ b/docs/Arquivo de Investigação - classificação.docx
@@ -66,7 +66,21 @@
               <w:right w:val="single" w:sz="24" w:space="0" w:color="auto"/>
             </w:tcBorders>
           </w:tcPr>
-          <w:p/>
+          <w:p>
+            <w:r>
+              <w:t>Nesse conjunto de dados, cada registro representa uma solicitação de empréstimo de um cliente, descrita por atributos como idade, renda, valor solicitado, score de crédito e perfil profissional. Cada solicitação é classificada como aprovada ou não</w:t>
+            </w:r>
+            <w:r>
+              <w:rPr>
+                <w:b/>
+                <w:bCs/>
+              </w:rPr>
+              <w:t xml:space="preserve"> </w:t>
+            </w:r>
+            <w:r>
+              <w:t>aprovada (1 ou 0), de acordo com o conjunto de atributos.</w:t>
+            </w:r>
+          </w:p>
         </w:tc>
       </w:tr>
       <w:tr>
@@ -99,7 +113,11 @@
               <w:right w:val="single" w:sz="24" w:space="0" w:color="auto"/>
             </w:tcBorders>
           </w:tcPr>
-          <w:p/>
+          <w:p>
+            <w:r>
+              <w:t>5001</w:t>
+            </w:r>
+          </w:p>
         </w:tc>
       </w:tr>
       <w:tr>
@@ -132,7 +150,11 @@
               <w:right w:val="single" w:sz="24" w:space="0" w:color="auto"/>
             </w:tcBorders>
           </w:tcPr>
-          <w:p/>
+          <w:p>
+            <w:r>
+              <w:t>9</w:t>
+            </w:r>
+          </w:p>
         </w:tc>
       </w:tr>
       <w:tr>
@@ -159,7 +181,11 @@
               <w:right w:val="single" w:sz="24" w:space="0" w:color="auto"/>
             </w:tcBorders>
           </w:tcPr>
-          <w:p/>
+          <w:p>
+            <w:r>
+              <w:t>0</w:t>
+            </w:r>
+          </w:p>
         </w:tc>
       </w:tr>
       <w:tr>
@@ -364,6 +390,9 @@
             <w:pPr>
               <w:jc w:val="center"/>
             </w:pPr>
+            <w:r>
+              <w:t>KNN</w:t>
+            </w:r>
           </w:p>
         </w:tc>
         <w:tc>
@@ -379,6 +408,12 @@
                 <w:lang w:val="en-US"/>
               </w:rPr>
             </w:pPr>
+            <w:r>
+              <w:rPr>
+                <w:lang w:val="en-US"/>
+              </w:rPr>
+              <w:t>K = 5</w:t>
+            </w:r>
           </w:p>
         </w:tc>
         <w:tc>
@@ -389,10 +424,38 @@
           <w:p>
             <w:pPr>
               <w:jc w:val="center"/>
-              <w:rPr>
-                <w:lang w:val="en-US"/>
-              </w:rPr>
-            </w:pPr>
+            </w:pPr>
+            <w:r>
+              <w:t xml:space="preserve">Balanceamento; </w:t>
+            </w:r>
+            <w:r>
+              <w:br/>
+              <w:t>Variaveis Dummy</w:t>
+            </w:r>
+            <w:r>
+              <w:br/>
+            </w:r>
+            <w:r>
+              <w:t>[</w:t>
+            </w:r>
+            <w:r>
+              <w:t>'City', 'Gender', 'Education', 'EmploymentType'</w:t>
+            </w:r>
+            <w:r>
+              <w:t>]</w:t>
+            </w:r>
+            <w:r>
+              <w:t>;</w:t>
+            </w:r>
+            <w:r>
+              <w:t xml:space="preserve"> </w:t>
+            </w:r>
+            <w:r>
+              <w:t>random_state = 0</w:t>
+            </w:r>
+            <w:r>
+              <w:t xml:space="preserve"> </w:t>
+            </w:r>
           </w:p>
         </w:tc>
         <w:tc>
@@ -407,6 +470,9 @@
                 <w:lang w:val="en-US"/>
               </w:rPr>
             </w:pPr>
+            <w:r>
+              <w:t>0.642361</w:t>
+            </w:r>
           </w:p>
         </w:tc>
         <w:tc>
@@ -424,6 +490,9 @@
                 <w:lang w:val="en-US"/>
               </w:rPr>
             </w:pPr>
+            <w:r>
+              <w:t>[[179, 103], [103, 191]]</w:t>
+            </w:r>
           </w:p>
         </w:tc>
       </w:tr>
@@ -443,6 +512,12 @@
                 <w:lang w:val="en-US"/>
               </w:rPr>
             </w:pPr>
+            <w:r>
+              <w:rPr>
+                <w:lang w:val="en-US"/>
+              </w:rPr>
+              <w:t>KNN</w:t>
+            </w:r>
           </w:p>
         </w:tc>
         <w:tc>
@@ -458,6 +533,12 @@
                 <w:lang w:val="en-US"/>
               </w:rPr>
             </w:pPr>
+            <w:r>
+              <w:rPr>
+                <w:lang w:val="en-US"/>
+              </w:rPr>
+              <w:t>K = 9</w:t>
+            </w:r>
           </w:p>
         </w:tc>
         <w:tc>
@@ -472,6 +553,37 @@
                 <w:lang w:val="en-US"/>
               </w:rPr>
             </w:pPr>
+            <w:r>
+              <w:t xml:space="preserve">Balanceamento; </w:t>
+            </w:r>
+            <w:r>
+              <w:br/>
+              <w:t>Variaveis Dummy</w:t>
+            </w:r>
+            <w:r>
+              <w:t xml:space="preserve"> </w:t>
+            </w:r>
+            <w:r>
+              <w:br/>
+            </w:r>
+            <w:r>
+              <w:t>[</w:t>
+            </w:r>
+            <w:r>
+              <w:t>'City', 'Gender', 'Education', 'EmploymentType'</w:t>
+            </w:r>
+            <w:r>
+              <w:t>]</w:t>
+            </w:r>
+            <w:r>
+              <w:t>;</w:t>
+            </w:r>
+            <w:r>
+              <w:t xml:space="preserve"> </w:t>
+            </w:r>
+            <w:r>
+              <w:t>random_state = 0</w:t>
+            </w:r>
           </w:p>
         </w:tc>
         <w:tc>
@@ -486,6 +598,9 @@
                 <w:lang w:val="en-US"/>
               </w:rPr>
             </w:pPr>
+            <w:r>
+              <w:t>0.644097</w:t>
+            </w:r>
           </w:p>
         </w:tc>
         <w:tc>
@@ -503,6 +618,9 @@
                 <w:lang w:val="en-US"/>
               </w:rPr>
             </w:pPr>
+            <w:r>
+              <w:t>[[172, 110], [95, 199]]</w:t>
+            </w:r>
           </w:p>
         </w:tc>
       </w:tr>
@@ -522,6 +640,12 @@
                 <w:lang w:val="en-US"/>
               </w:rPr>
             </w:pPr>
+            <w:r>
+              <w:rPr>
+                <w:lang w:val="en-US"/>
+              </w:rPr>
+              <w:t>KNN</w:t>
+            </w:r>
           </w:p>
         </w:tc>
         <w:tc>
@@ -537,6 +661,18 @@
                 <w:lang w:val="en-US"/>
               </w:rPr>
             </w:pPr>
+            <w:r>
+              <w:rPr>
+                <w:lang w:val="en-US"/>
+              </w:rPr>
+              <w:t xml:space="preserve">K = </w:t>
+            </w:r>
+            <w:r>
+              <w:rPr>
+                <w:lang w:val="en-US"/>
+              </w:rPr>
+              <w:t>15</w:t>
+            </w:r>
           </w:p>
         </w:tc>
         <w:tc>
@@ -547,10 +683,40 @@
           <w:p>
             <w:pPr>
               <w:jc w:val="center"/>
-              <w:rPr>
-                <w:lang w:val="en-US"/>
-              </w:rPr>
-            </w:pPr>
+            </w:pPr>
+            <w:r>
+              <w:t xml:space="preserve">Balanceamento; </w:t>
+            </w:r>
+            <w:r>
+              <w:br/>
+              <w:t>Variaveis Dummy</w:t>
+            </w:r>
+            <w:r>
+              <w:br/>
+            </w:r>
+            <w:r>
+              <w:t>[</w:t>
+            </w:r>
+            <w:r>
+              <w:t>'City', 'Gender', 'Education', 'EmploymentType'</w:t>
+            </w:r>
+            <w:r>
+              <w:t>]</w:t>
+            </w:r>
+            <w:r>
+              <w:t>;</w:t>
+            </w:r>
+          </w:p>
+          <w:p>
+            <w:pPr>
+              <w:jc w:val="center"/>
+              <w:rPr>
+                <w:lang w:val="en-US"/>
+              </w:rPr>
+            </w:pPr>
+            <w:r>
+              <w:t>random_state = 0</w:t>
+            </w:r>
           </w:p>
         </w:tc>
         <w:tc>
@@ -565,6 +731,9 @@
                 <w:lang w:val="en-US"/>
               </w:rPr>
             </w:pPr>
+            <w:r>
+              <w:t>0.651042</w:t>
+            </w:r>
           </w:p>
         </w:tc>
         <w:tc>
@@ -582,6 +751,9 @@
                 <w:lang w:val="en-US"/>
               </w:rPr>
             </w:pPr>
+            <w:r>
+              <w:t>[[163, 119], [82, 212]]</w:t>
+            </w:r>
           </w:p>
         </w:tc>
       </w:tr>
@@ -601,6 +773,12 @@
                 <w:lang w:val="en-US"/>
               </w:rPr>
             </w:pPr>
+            <w:r>
+              <w:rPr>
+                <w:lang w:val="en-US"/>
+              </w:rPr>
+              <w:t>KNN</w:t>
+            </w:r>
           </w:p>
         </w:tc>
         <w:tc>
@@ -616,6 +794,12 @@
                 <w:lang w:val="en-US"/>
               </w:rPr>
             </w:pPr>
+            <w:r>
+              <w:rPr>
+                <w:lang w:val="en-US"/>
+              </w:rPr>
+              <w:t>K = 16</w:t>
+            </w:r>
           </w:p>
         </w:tc>
         <w:tc>
@@ -626,10 +810,40 @@
           <w:p>
             <w:pPr>
               <w:jc w:val="center"/>
-              <w:rPr>
-                <w:lang w:val="en-US"/>
-              </w:rPr>
-            </w:pPr>
+            </w:pPr>
+            <w:r>
+              <w:t xml:space="preserve">Balanceamento; </w:t>
+            </w:r>
+            <w:r>
+              <w:br/>
+              <w:t>Variaveis Dummy</w:t>
+            </w:r>
+            <w:r>
+              <w:br/>
+            </w:r>
+            <w:r>
+              <w:t>[</w:t>
+            </w:r>
+            <w:r>
+              <w:t>'City', 'Gender', 'Education', 'EmploymentType'</w:t>
+            </w:r>
+            <w:r>
+              <w:t>]</w:t>
+            </w:r>
+            <w:r>
+              <w:t>;</w:t>
+            </w:r>
+          </w:p>
+          <w:p>
+            <w:pPr>
+              <w:jc w:val="center"/>
+              <w:rPr>
+                <w:lang w:val="en-US"/>
+              </w:rPr>
+            </w:pPr>
+            <w:r>
+              <w:t>random_state = 0</w:t>
+            </w:r>
           </w:p>
         </w:tc>
         <w:tc>
@@ -644,6 +858,9 @@
                 <w:lang w:val="en-US"/>
               </w:rPr>
             </w:pPr>
+            <w:r>
+              <w:t>0.645833</w:t>
+            </w:r>
           </w:p>
         </w:tc>
         <w:tc>
@@ -661,6 +878,9 @@
                 <w:lang w:val="en-US"/>
               </w:rPr>
             </w:pPr>
+            <w:r>
+              <w:t>[[179, 103], [101, 193]]</w:t>
+            </w:r>
           </w:p>
         </w:tc>
       </w:tr>
@@ -680,6 +900,9 @@
                 <w:lang w:val="en-US"/>
               </w:rPr>
             </w:pPr>
+            <w:r>
+              <w:t>Naive Bayes</w:t>
+            </w:r>
           </w:p>
         </w:tc>
         <w:tc>
@@ -695,6 +918,9 @@
                 <w:lang w:val="en-US"/>
               </w:rPr>
             </w:pPr>
+            <w:r>
+              <w:t>GaussianNB</w:t>
+            </w:r>
           </w:p>
         </w:tc>
         <w:tc>
@@ -709,6 +935,9 @@
                 <w:lang w:val="en-US"/>
               </w:rPr>
             </w:pPr>
+            <w:r>
+              <w:t>Balanceamento; Variáveis Dummy ['City', 'Gender', 'Education', 'EmploymentType']; cols_categoria_ordinal = []; random_state = 0</w:t>
+            </w:r>
           </w:p>
         </w:tc>
         <w:tc>
@@ -723,6 +952,9 @@
                 <w:lang w:val="en-US"/>
               </w:rPr>
             </w:pPr>
+            <w:r>
+              <w:t>0.873264</w:t>
+            </w:r>
           </w:p>
         </w:tc>
         <w:tc>
@@ -736,10 +968,21 @@
           <w:p>
             <w:pPr>
               <w:jc w:val="center"/>
-              <w:rPr>
-                <w:lang w:val="en-US"/>
-              </w:rPr>
-            </w:pPr>
+            </w:pPr>
+            <w:r>
+              <w:t>[[228, 54],</w:t>
+            </w:r>
+          </w:p>
+          <w:p>
+            <w:pPr>
+              <w:jc w:val="center"/>
+              <w:rPr>
+                <w:lang w:val="en-US"/>
+              </w:rPr>
+            </w:pPr>
+            <w:r>
+              <w:t>[19, 275]]</w:t>
+            </w:r>
           </w:p>
         </w:tc>
       </w:tr>
@@ -1806,7 +2049,6 @@
   <w:style w:type="character" w:default="1" w:styleId="Fontepargpadro">
     <w:name w:val="Default Paragraph Font"/>
     <w:uiPriority w:val="1"/>
-    <w:semiHidden/>
     <w:unhideWhenUsed/>
   </w:style>
   <w:style w:type="table" w:default="1" w:styleId="Tabelanormal">
@@ -2114,10 +2356,26 @@
 </file>
 
 <file path=customXml/item1.xml><?xml version="1.0" encoding="utf-8"?>
-<b:Sources xmlns:b="http://schemas.openxmlformats.org/officeDocument/2006/bibliography" xmlns="http://schemas.openxmlformats.org/officeDocument/2006/bibliography" SelectedStyle="\APASixthEditionOfficeOnline.xsl" StyleName="APA" Version="6"/>
+<p:properties xmlns:p="http://schemas.microsoft.com/office/2006/metadata/properties" xmlns:xsi="http://www.w3.org/2001/XMLSchema-instance" xmlns:pc="http://schemas.microsoft.com/office/infopath/2007/PartnerControls">
+  <documentManagement>
+    <lcf76f155ced4ddcb4097134ff3c332f xmlns="ab157843-751e-4736-af67-1fc677112fd5">
+      <Terms xmlns="http://schemas.microsoft.com/office/infopath/2007/PartnerControls"/>
+    </lcf76f155ced4ddcb4097134ff3c332f>
+    <TaxCatchAll xmlns="ecafa820-e5d1-45f6-b947-69321225fd2e" xsi:nil="true"/>
+  </documentManagement>
+</p:properties>
 </file>
 
 <file path=customXml/item2.xml><?xml version="1.0" encoding="utf-8"?>
+<?mso-contentType ?>
+<FormTemplates xmlns="http://schemas.microsoft.com/sharepoint/v3/contenttype/forms">
+  <Display>DocumentLibraryForm</Display>
+  <Edit>DocumentLibraryForm</Edit>
+  <New>DocumentLibraryForm</New>
+</FormTemplates>
+</file>
+
+<file path=customXml/item3.xml><?xml version="1.0" encoding="utf-8"?>
 <ct:contentTypeSchema xmlns:ct="http://schemas.microsoft.com/office/2006/metadata/contentType" xmlns:ma="http://schemas.microsoft.com/office/2006/metadata/properties/metaAttributes" ct:_="" ma:_="" ma:contentTypeName="Documento" ma:contentTypeID="0x0101008445836416C7C142B9190D37D75D98A9" ma:contentTypeVersion="10" ma:contentTypeDescription="Crie um novo documento." ma:contentTypeScope="" ma:versionID="46ffd406e04f8079ba29262aae37ef90">
   <xsd:schema xmlns:xsd="http://www.w3.org/2001/XMLSchema" xmlns:xs="http://www.w3.org/2001/XMLSchema" xmlns:p="http://schemas.microsoft.com/office/2006/metadata/properties" xmlns:ns2="ab157843-751e-4736-af67-1fc677112fd5" xmlns:ns3="ecafa820-e5d1-45f6-b947-69321225fd2e" targetNamespace="http://schemas.microsoft.com/office/2006/metadata/properties" ma:root="true" ma:fieldsID="f536e7a34482e1c211c535781e745146" ns2:_="" ns3:_="">
     <xsd:import namespace="ab157843-751e-4736-af67-1fc677112fd5"/>
@@ -2306,42 +2564,52 @@
 </ct:contentTypeSchema>
 </file>
 
-<file path=customXml/item3.xml><?xml version="1.0" encoding="utf-8"?>
-<?mso-contentType ?>
-<FormTemplates xmlns="http://schemas.microsoft.com/sharepoint/v3/contenttype/forms">
-  <Display>DocumentLibraryForm</Display>
-  <Edit>DocumentLibraryForm</Edit>
-  <New>DocumentLibraryForm</New>
-</FormTemplates>
-</file>
-
 <file path=customXml/item4.xml><?xml version="1.0" encoding="utf-8"?>
-<p:properties xmlns:p="http://schemas.microsoft.com/office/2006/metadata/properties" xmlns:xsi="http://www.w3.org/2001/XMLSchema-instance" xmlns:pc="http://schemas.microsoft.com/office/infopath/2007/PartnerControls">
-  <documentManagement>
-    <lcf76f155ced4ddcb4097134ff3c332f xmlns="ab157843-751e-4736-af67-1fc677112fd5">
-      <Terms xmlns="http://schemas.microsoft.com/office/infopath/2007/PartnerControls"/>
-    </lcf76f155ced4ddcb4097134ff3c332f>
-    <TaxCatchAll xmlns="ecafa820-e5d1-45f6-b947-69321225fd2e" xsi:nil="true"/>
-  </documentManagement>
-</p:properties>
+<b:Sources xmlns:b="http://schemas.openxmlformats.org/officeDocument/2006/bibliography" xmlns="http://schemas.openxmlformats.org/officeDocument/2006/bibliography" SelectedStyle="\APASixthEditionOfficeOnline.xsl" StyleName="APA" Version="6"/>
 </file>
 
 <file path=customXml/itemProps1.xml><?xml version="1.0" encoding="utf-8"?>
+<ds:datastoreItem xmlns:ds="http://schemas.openxmlformats.org/officeDocument/2006/customXml" ds:itemID="{44487713-5348-4979-B098-C82815C673F6}">
+  <ds:schemaRefs>
+    <ds:schemaRef ds:uri="http://schemas.microsoft.com/office/2006/metadata/properties"/>
+    <ds:schemaRef ds:uri="http://schemas.microsoft.com/office/infopath/2007/PartnerControls"/>
+    <ds:schemaRef ds:uri="ab157843-751e-4736-af67-1fc677112fd5"/>
+    <ds:schemaRef ds:uri="ecafa820-e5d1-45f6-b947-69321225fd2e"/>
+  </ds:schemaRefs>
+</ds:datastoreItem>
+</file>
+
+<file path=customXml/itemProps2.xml><?xml version="1.0" encoding="utf-8"?>
+<ds:datastoreItem xmlns:ds="http://schemas.openxmlformats.org/officeDocument/2006/customXml" ds:itemID="{E342F9E3-D5A2-4A51-AC0A-F3F5031810B8}">
+  <ds:schemaRefs>
+    <ds:schemaRef ds:uri="http://schemas.microsoft.com/sharepoint/v3/contenttype/forms"/>
+  </ds:schemaRefs>
+</ds:datastoreItem>
+</file>
+
+<file path=customXml/itemProps3.xml><?xml version="1.0" encoding="utf-8"?>
+<ds:datastoreItem xmlns:ds="http://schemas.openxmlformats.org/officeDocument/2006/customXml" ds:itemID="{20C58C3F-3BDD-445B-9987-416415EEB64B}">
+  <ds:schemaRefs>
+    <ds:schemaRef ds:uri="http://schemas.microsoft.com/office/2006/metadata/contentType"/>
+    <ds:schemaRef ds:uri="http://schemas.microsoft.com/office/2006/metadata/properties/metaAttributes"/>
+    <ds:schemaRef ds:uri="http://www.w3.org/2001/XMLSchema"/>
+    <ds:schemaRef ds:uri="http://schemas.microsoft.com/office/2006/metadata/properties"/>
+    <ds:schemaRef ds:uri="ab157843-751e-4736-af67-1fc677112fd5"/>
+    <ds:schemaRef ds:uri="ecafa820-e5d1-45f6-b947-69321225fd2e"/>
+    <ds:schemaRef ds:uri="http://schemas.microsoft.com/office/2006/documentManagement/types"/>
+    <ds:schemaRef ds:uri="http://schemas.microsoft.com/office/infopath/2007/PartnerControls"/>
+    <ds:schemaRef ds:uri="http://schemas.openxmlformats.org/package/2006/metadata/core-properties"/>
+    <ds:schemaRef ds:uri="http://purl.org/dc/elements/1.1/"/>
+    <ds:schemaRef ds:uri="http://purl.org/dc/terms/"/>
+    <ds:schemaRef ds:uri="http://schemas.microsoft.com/internal/obd"/>
+  </ds:schemaRefs>
+</ds:datastoreItem>
+</file>
+
+<file path=customXml/itemProps4.xml><?xml version="1.0" encoding="utf-8"?>
 <ds:datastoreItem xmlns:ds="http://schemas.openxmlformats.org/officeDocument/2006/customXml" ds:itemID="{2032E85D-2C03-44D3-BA39-7AAF1AC10869}">
   <ds:schemaRefs>
     <ds:schemaRef ds:uri="http://schemas.openxmlformats.org/officeDocument/2006/bibliography"/>
   </ds:schemaRefs>
 </ds:datastoreItem>
-</file>
-
-<file path=customXml/itemProps2.xml><?xml version="1.0" encoding="utf-8"?>
-<ds:datastoreItem xmlns:ds="http://schemas.openxmlformats.org/officeDocument/2006/customXml" ds:itemID="{20C58C3F-3BDD-445B-9987-416415EEB64B}"/>
-</file>
-
-<file path=customXml/itemProps3.xml><?xml version="1.0" encoding="utf-8"?>
-<ds:datastoreItem xmlns:ds="http://schemas.openxmlformats.org/officeDocument/2006/customXml" ds:itemID="{E342F9E3-D5A2-4A51-AC0A-F3F5031810B8}"/>
-</file>
-
-<file path=customXml/itemProps4.xml><?xml version="1.0" encoding="utf-8"?>
-<ds:datastoreItem xmlns:ds="http://schemas.openxmlformats.org/officeDocument/2006/customXml" ds:itemID="{44487713-5348-4979-B098-C82815C673F6}"/>
 </file>
</xml_diff>